<commit_message>
Add supplementary quantum ablation study section to report
</commit_message>
<xml_diff>
--- a/docs/report/Technical_Report.docx
+++ b/docs/report/Technical_Report.docx
@@ -3953,19 +3953,88 @@
         <w:spacing w:before="80" w:after="240"/>
         <w:jc w:val="center"/>
         <w:rPr>
-          <w:sz w:val="28"/>
-          <w:szCs w:val="28"/>
-        </w:rPr>
-      </w:pPr>
-      <w:r>
-        <w:rPr>
           <w:rFonts w:eastAsia="Calibri"/>
           <w:i/>
           <w:iCs/>
           <w:sz w:val="28"/>
           <w:szCs w:val="28"/>
         </w:rPr>
+      </w:pPr>
+      <w:r>
+        <w:rPr>
+          <w:rFonts w:eastAsia="Calibri"/>
+          <w:i/>
+          <w:iCs/>
+          <w:sz w:val="28"/>
+          <w:szCs w:val="28"/>
+        </w:rPr>
         <w:t>Table 2: EV Battery Cooling — PINN vs. QAPINN comparison.</w:t>
+      </w:r>
+    </w:p>
+    <w:p>
+      <w:pPr>
+        <w:pStyle w:val="Heading2"/>
+        <w:rPr>
+          <w:rFonts w:eastAsia="Calibri"/>
+          <w:sz w:val="28"/>
+          <w:szCs w:val="28"/>
+        </w:rPr>
+      </w:pPr>
+      <w:r>
+        <w:rPr>
+          <w:rFonts w:eastAsia="Calibri"/>
+          <w:sz w:val="28"/>
+          <w:szCs w:val="28"/>
+        </w:rPr>
+        <w:t>7.2.1 Supplementary Quantum Circuit Ablation Study</w:t>
+      </w:r>
+    </w:p>
+    <w:p>
+      <w:pPr>
+        <w:spacing w:before="80" w:after="240" w:line="276" w:lineRule="auto"/>
+        <w:rPr>
+          <w:sz w:val="28"/>
+          <w:szCs w:val="28"/>
+        </w:rPr>
+      </w:pPr>
+      <w:r>
+        <w:rPr>
+          <w:sz w:val="28"/>
+          <w:szCs w:val="28"/>
+        </w:rPr>
+        <w:t>In addition to the primary PINN-vs-QAPINN comparison, a supplementary ablation study was conducted on the EV Battery Cooling case study to explore the effect of quantum circuit design choices on QAPINN performance. This included variations in data encoding strategy (amplitude encoding), entanglement topology (no entanglement, linear entanglement, ring entanglement), and measurement configuration. These experiments are available in the project repository under notebooks/</w:t>
+      </w:r>
+      <w:proofErr w:type="spellStart"/>
+      <w:r>
+        <w:rPr>
+          <w:sz w:val="28"/>
+          <w:szCs w:val="28"/>
+        </w:rPr>
+        <w:t>ev_battery_cooling</w:t>
+      </w:r>
+      <w:proofErr w:type="spellEnd"/>
+      <w:r>
+        <w:rPr>
+          <w:sz w:val="28"/>
+          <w:szCs w:val="28"/>
+        </w:rPr>
+        <w:t>/</w:t>
+      </w:r>
+      <w:proofErr w:type="spellStart"/>
+      <w:r>
+        <w:rPr>
+          <w:sz w:val="28"/>
+          <w:szCs w:val="28"/>
+        </w:rPr>
+        <w:t>quantum_ablation_study</w:t>
+      </w:r>
+      <w:proofErr w:type="spellEnd"/>
+      <w:r>
+        <w:rPr>
+          <w:sz w:val="28"/>
+          <w:szCs w:val="28"/>
+        </w:rPr>
+        <w:t>/, and provide additional exploratory evidence beyond the primary depth ablation reported in Section 7.3. Given time constraints, a full quantitative comparison across all encoding/entanglement variants is left as future work (Section 8.2).</w:t>
       </w:r>
     </w:p>
     <w:p>
@@ -4061,6 +4130,7 @@
                 <w:sz w:val="28"/>
                 <w:szCs w:val="28"/>
               </w:rPr>
+              <w:lastRenderedPageBreak/>
               <w:t>Configuration</w:t>
             </w:r>
           </w:p>
@@ -5006,7 +5076,16 @@
           <w:sz w:val="28"/>
           <w:szCs w:val="28"/>
         </w:rPr>
-        <w:t>Despite its lower accuracy, the QAPINN consistently required fewer trainable parameters than the corresponding classical PINN. For the Heat Equation, the QAPINN used 577 parameters, compared with 921 parameters for the classical PINN, corresponding to approximately 63% of the classical model size. For the EV Battery Cooling case, the QAPINN used 1,501 parameters, compared with 3,297 parameters for the PINN, corresponding to approximately 46% of the classical model size.</w:t>
+        <w:t xml:space="preserve">Despite its lower accuracy, the QAPINN consistently required fewer trainable parameters than the corresponding classical PINN. For the Heat Equation, the QAPINN used 577 parameters, compared with 921 parameters for the classical PINN, corresponding to approximately 63% of the classical model size. For the EV Battery Cooling case, the QAPINN used 1,501 parameters, compared with 3,297 </w:t>
+      </w:r>
+      <w:r>
+        <w:rPr>
+          <w:rFonts w:eastAsia="Calibri"/>
+          <w:sz w:val="28"/>
+          <w:szCs w:val="28"/>
+        </w:rPr>
+        <w:lastRenderedPageBreak/>
+        <w:t>parameters for the PINN, corresponding to approximately 46% of the classical model size.</w:t>
       </w:r>
     </w:p>
     <w:p>
@@ -5079,7 +5158,90 @@
           <w:sz w:val="28"/>
           <w:szCs w:val="28"/>
         </w:rPr>
-        <w:t xml:space="preserve">Training-time results differed considerably between the two case studies and therefore require careful interpretation. For the Heat Equation, the QAPINN </w:t>
+        <w:t>Training-time results differed considerably between the two case studies and therefore require careful interpretation. For the Heat Equation, the QAPINN required approximately 650 seconds, compared with only 15.5 seconds for the classical PINN, resulting in an approximately 42× longer training time. In contrast, for the EV Battery Cooling case, the QAPINN required approximately 110 seconds, while the classical PINN required 350 seconds.</w:t>
+      </w:r>
+    </w:p>
+    <w:p>
+      <w:pPr>
+        <w:spacing w:line="276" w:lineRule="auto"/>
+        <w:rPr>
+          <w:rFonts w:eastAsia="Calibri"/>
+          <w:sz w:val="28"/>
+          <w:szCs w:val="28"/>
+        </w:rPr>
+      </w:pPr>
+      <w:r>
+        <w:rPr>
+          <w:rFonts w:eastAsia="Calibri"/>
+          <w:sz w:val="28"/>
+          <w:szCs w:val="28"/>
+        </w:rPr>
+        <w:t>However, this apparent speed advantage of QAPINN in the EV Battery case should not be interpreted as evidence of an inherent computational advantage. The two models were trained using different epoch budgets: the QAPINN was trained for 500 epochs, whereas the classical PINN was trained for 3,000 epochs. Consequently, the training-time comparison is not a controlled head-to-head benchmark. The difference is likely influenced substantially by the number of optimization steps rather than by the quantum architecture itself. Training-time results across the two case studies should therefore be interpreted cautiously.</w:t>
+      </w:r>
+    </w:p>
+    <w:p>
+      <w:pPr>
+        <w:rPr>
+          <w:rFonts w:eastAsia="Calibri"/>
+          <w:sz w:val="28"/>
+          <w:szCs w:val="28"/>
+        </w:rPr>
+      </w:pPr>
+    </w:p>
+    <w:p>
+      <w:pPr>
+        <w:pStyle w:val="Heading2"/>
+        <w:rPr>
+          <w:rFonts w:eastAsia="Calibri"/>
+        </w:rPr>
+      </w:pPr>
+      <w:r>
+        <w:rPr>
+          <w:rFonts w:eastAsia="Calibri"/>
+        </w:rPr>
+        <w:t>d</w:t>
+      </w:r>
+      <w:r>
+        <w:rPr>
+          <w:rFonts w:eastAsia="Calibri"/>
+        </w:rPr>
+        <w:t>. Memory Usage</w:t>
+      </w:r>
+    </w:p>
+    <w:p>
+      <w:pPr>
+        <w:spacing w:line="276" w:lineRule="auto"/>
+        <w:rPr>
+          <w:rFonts w:eastAsia="Calibri"/>
+          <w:sz w:val="28"/>
+          <w:szCs w:val="28"/>
+        </w:rPr>
+      </w:pPr>
+      <w:r>
+        <w:rPr>
+          <w:rFonts w:eastAsia="Calibri"/>
+          <w:sz w:val="28"/>
+          <w:szCs w:val="28"/>
+        </w:rPr>
+        <w:t>The QAPINN consistently required more memory than the classical PINN in both case studies. For the Heat Equation, memory consumption was approximately 777 MB for QAPINN compared with 388 MB for PINN. For the EV Battery Cooling case, QAPINN consumed approximately 820 MB, while the classical PINN used 685 MB.</w:t>
+      </w:r>
+    </w:p>
+    <w:p>
+      <w:pPr>
+        <w:spacing w:line="276" w:lineRule="auto"/>
+        <w:rPr>
+          <w:rFonts w:eastAsia="Calibri"/>
+          <w:sz w:val="28"/>
+          <w:szCs w:val="28"/>
+        </w:rPr>
+      </w:pPr>
+      <w:r>
+        <w:rPr>
+          <w:rFonts w:eastAsia="Calibri"/>
+          <w:sz w:val="28"/>
+          <w:szCs w:val="28"/>
+        </w:rPr>
+        <w:t xml:space="preserve">This increased memory requirement is primarily associated with the overhead of classically simulating quantum circuits, particularly through the state-vector simulation used in the PennyLane framework. Although quantum hardware could potentially eliminate some of the classical simulation overhead, such benefits </w:t>
       </w:r>
       <w:r>
         <w:rPr>
@@ -5088,7 +5250,36 @@
           <w:szCs w:val="28"/>
         </w:rPr>
         <w:lastRenderedPageBreak/>
-        <w:t>required approximately 650 seconds, compared with only 15.5 seconds for the classical PINN, resulting in an approximately 42× longer training time. In contrast, for the EV Battery Cooling case, the QAPINN required approximately 110 seconds, while the classical PINN required 350 seconds.</w:t>
+        <w:t>cannot be demonstrated in the current experiments because the quantum circuits are executed entirely through classical simulation.</w:t>
+      </w:r>
+    </w:p>
+    <w:p>
+      <w:pPr>
+        <w:rPr>
+          <w:rFonts w:eastAsia="Calibri"/>
+          <w:sz w:val="28"/>
+          <w:szCs w:val="28"/>
+        </w:rPr>
+      </w:pPr>
+    </w:p>
+    <w:p>
+      <w:pPr>
+        <w:pStyle w:val="Heading2"/>
+        <w:rPr>
+          <w:rFonts w:eastAsia="Calibri"/>
+        </w:rPr>
+      </w:pPr>
+      <w:r>
+        <w:rPr>
+          <w:rFonts w:eastAsia="Calibri"/>
+        </w:rPr>
+        <w:t>e</w:t>
+      </w:r>
+      <w:r>
+        <w:rPr>
+          <w:rFonts w:eastAsia="Calibri"/>
+        </w:rPr>
+        <w:t>. Overall Cross-Case Study Findings</w:t>
       </w:r>
     </w:p>
     <w:p>
@@ -5106,36 +5297,7 @@
           <w:sz w:val="28"/>
           <w:szCs w:val="28"/>
         </w:rPr>
-        <w:t>However, this apparent speed advantage of QAPINN in the EV Battery case should not be interpreted as evidence of an inherent computational advantage. The two models were trained using different epoch budgets: the QAPINN was trained for 500 epochs, whereas the classical PINN was trained for 3,000 epochs. Consequently, the training-time comparison is not a controlled head-to-head benchmark. The difference is likely influenced substantially by the number of optimization steps rather than by the quantum architecture itself. Training-time results across the two case studies should therefore be interpreted cautiously.</w:t>
-      </w:r>
-    </w:p>
-    <w:p>
-      <w:pPr>
-        <w:rPr>
-          <w:rFonts w:eastAsia="Calibri"/>
-          <w:sz w:val="28"/>
-          <w:szCs w:val="28"/>
-        </w:rPr>
-      </w:pPr>
-    </w:p>
-    <w:p>
-      <w:pPr>
-        <w:pStyle w:val="Heading2"/>
-        <w:rPr>
-          <w:rFonts w:eastAsia="Calibri"/>
-        </w:rPr>
-      </w:pPr>
-      <w:r>
-        <w:rPr>
-          <w:rFonts w:eastAsia="Calibri"/>
-        </w:rPr>
-        <w:t>d</w:t>
-      </w:r>
-      <w:r>
-        <w:rPr>
-          <w:rFonts w:eastAsia="Calibri"/>
-        </w:rPr>
-        <w:t>. Memory Usage</w:t>
+        <w:t>Taken together, the two case studies indicate that, under classical simulation of small-scale 2–4 qubit variational quantum circuits, QAPINN does not currently outperform the classical PINN in terms of overall numerical accuracy, computational efficiency, or memory consumption. The classical PINN achieved lower relative L2 error in both PDE problems and generally required less memory. The training-time comparison was inconsistent and was strongly affected by differences in the number of training epochs.</w:t>
       </w:r>
     </w:p>
     <w:p>
@@ -5153,90 +5315,6 @@
           <w:sz w:val="28"/>
           <w:szCs w:val="28"/>
         </w:rPr>
-        <w:t>The QAPINN consistently required more memory than the classical PINN in both case studies. For the Heat Equation, memory consumption was approximately 777 MB for QAPINN compared with 388 MB for PINN. For the EV Battery Cooling case, QAPINN consumed approximately 820 MB, while the classical PINN used 685 MB.</w:t>
-      </w:r>
-    </w:p>
-    <w:p>
-      <w:pPr>
-        <w:spacing w:line="276" w:lineRule="auto"/>
-        <w:rPr>
-          <w:rFonts w:eastAsia="Calibri"/>
-          <w:sz w:val="28"/>
-          <w:szCs w:val="28"/>
-        </w:rPr>
-      </w:pPr>
-      <w:r>
-        <w:rPr>
-          <w:rFonts w:eastAsia="Calibri"/>
-          <w:sz w:val="28"/>
-          <w:szCs w:val="28"/>
-        </w:rPr>
-        <w:t>This increased memory requirement is primarily associated with the overhead of classically simulating quantum circuits, particularly through the state-vector simulation used in the PennyLane framework. Although quantum hardware could potentially eliminate some of the classical simulation overhead, such benefits cannot be demonstrated in the current experiments because the quantum circuits are executed entirely through classical simulation.</w:t>
-      </w:r>
-    </w:p>
-    <w:p>
-      <w:pPr>
-        <w:rPr>
-          <w:rFonts w:eastAsia="Calibri"/>
-          <w:sz w:val="28"/>
-          <w:szCs w:val="28"/>
-        </w:rPr>
-      </w:pPr>
-    </w:p>
-    <w:p>
-      <w:pPr>
-        <w:pStyle w:val="Heading2"/>
-        <w:rPr>
-          <w:rFonts w:eastAsia="Calibri"/>
-        </w:rPr>
-      </w:pPr>
-      <w:r>
-        <w:rPr>
-          <w:rFonts w:eastAsia="Calibri"/>
-        </w:rPr>
-        <w:t>e</w:t>
-      </w:r>
-      <w:r>
-        <w:rPr>
-          <w:rFonts w:eastAsia="Calibri"/>
-        </w:rPr>
-        <w:t>. Overall Cross-Case Study Findings</w:t>
-      </w:r>
-    </w:p>
-    <w:p>
-      <w:pPr>
-        <w:spacing w:line="276" w:lineRule="auto"/>
-        <w:rPr>
-          <w:rFonts w:eastAsia="Calibri"/>
-          <w:sz w:val="28"/>
-          <w:szCs w:val="28"/>
-        </w:rPr>
-      </w:pPr>
-      <w:r>
-        <w:rPr>
-          <w:rFonts w:eastAsia="Calibri"/>
-          <w:sz w:val="28"/>
-          <w:szCs w:val="28"/>
-        </w:rPr>
-        <w:t>Taken together, the two case studies indicate that, under classical simulation of small-scale 2–4 qubit variational quantum circuits, QAPINN does not currently outperform the classical PINN in terms of overall numerical accuracy, computational efficiency, or memory consumption. The classical PINN achieved lower relative L2 error in both PDE problems and generally required less memory. The training-time comparison was inconsistent and was strongly affected by differences in the number of training epochs.</w:t>
-      </w:r>
-    </w:p>
-    <w:p>
-      <w:pPr>
-        <w:spacing w:line="276" w:lineRule="auto"/>
-        <w:rPr>
-          <w:rFonts w:eastAsia="Calibri"/>
-          <w:sz w:val="28"/>
-          <w:szCs w:val="28"/>
-        </w:rPr>
-      </w:pPr>
-      <w:r>
-        <w:rPr>
-          <w:rFonts w:eastAsia="Calibri"/>
-          <w:sz w:val="28"/>
-          <w:szCs w:val="28"/>
-        </w:rPr>
-        <w:lastRenderedPageBreak/>
         <w:t>The primary advantage observed for QAPINN was parameter efficiency. Across both case studies, QAPINN achieved substantial reductions in the number of trainable parameters while still producing physically meaningful PDE solutions. However, this reduction in parameter count did not result in improved accuracy or overall computational efficiency.</w:t>
       </w:r>
     </w:p>
@@ -5359,7 +5437,16 @@
           <w:sz w:val="28"/>
           <w:szCs w:val="28"/>
         </w:rPr>
-        <w:t>benchmarking them against matched classical PINN baselines and studying the effect of variational quantum circuit depth on model performance.</w:t>
+        <w:t xml:space="preserve">benchmarking them against matched classical </w:t>
+      </w:r>
+      <w:r>
+        <w:rPr>
+          <w:rFonts w:eastAsia="Calibri"/>
+          <w:sz w:val="28"/>
+          <w:szCs w:val="28"/>
+        </w:rPr>
+        <w:lastRenderedPageBreak/>
+        <w:t>PINN baselines and studying the effect of variational quantum circuit depth on model performance.</w:t>
       </w:r>
     </w:p>
     <w:p>
@@ -5440,7 +5527,6 @@
           <w:sz w:val="28"/>
           <w:szCs w:val="28"/>
         </w:rPr>
-        <w:lastRenderedPageBreak/>
         <w:t>The case studies use relatively low-dimensional PDEs (1D/2D domains); scaling to higher-dimensional, industrial-scale manufacturing geometries has not been evaluated.</w:t>
       </w:r>
     </w:p>
@@ -5702,6 +5788,7 @@
           <w:sz w:val="28"/>
           <w:szCs w:val="28"/>
         </w:rPr>
+        <w:lastRenderedPageBreak/>
         <w:t xml:space="preserve">[4] M. Cerezo, A. Arrasmith, R. </w:t>
       </w:r>
       <w:proofErr w:type="spellStart"/>
@@ -5810,7 +5897,6 @@
           <w:sz w:val="28"/>
           <w:szCs w:val="28"/>
         </w:rPr>
-        <w:lastRenderedPageBreak/>
         <w:t xml:space="preserve">[7] J. Biamonte, P. Wittek, N. Pancotti, P. </w:t>
       </w:r>
       <w:proofErr w:type="spellStart"/>
@@ -6603,6 +6689,7 @@
   <w:style w:type="character" w:default="1" w:styleId="DefaultParagraphFont">
     <w:name w:val="Default Paragraph Font"/>
     <w:uiPriority w:val="1"/>
+    <w:semiHidden/>
     <w:unhideWhenUsed/>
   </w:style>
   <w:style w:type="table" w:default="1" w:styleId="TableNormal">

</xml_diff>